<commit_message>
chore: update .ai-specs/tese-doutorado-iconocracy-full-spec.md, .claude/skills/gitnexus/gitnexus-cli/SKILL.md
</commit_message>
<xml_diff>
--- a/tese/tese_completa.docx
+++ b/tese/tese_completa.docx
@@ -5086,7 +5086,7 @@
         <w:t xml:space="preserve"> </w:t>
       </w:r>
       <w:r>
-        <w:t xml:space="preserve">§§3.2 e 3.3 consolidados a partir de rascunhos autorais (28-abr-2026); §§3.1 e 3.4 ainda esqueleto.</w:t>
+        <w:t xml:space="preserve">§§3.1, 3.2 e 3.3 consolidados a partir de rascunhos autorais e brainstorm de transição Eixo 1/Eixo 3 (27-jun-2026); §3.4 ainda esqueleto.</w:t>
       </w:r>
       <w:r>
         <w:t xml:space="preserve"> </w:t>
@@ -5105,7 +5105,7 @@
         <w:t xml:space="preserve">ver listas ao fim de cada §; Villares, Rops, Roty, Moitte/Janinet, Huygebaert (2018), Schwarcz, Mills (1997). Verificar inauguração do Monument aux Pionniers; confirmar capítulo de Huygebaert sobre iconografia colonial belga.</w:t>
       </w:r>
     </w:p>
-    <w:bookmarkStart w:id="52" w:name="Xfea5c1964b4132d77fe7566b9b2ddd2e83018fa"/>
+    <w:bookmarkStart w:id="52" w:name="Xeaa7101875133fe05e660a78aa17eeefe7c8538"/>
     <w:p>
       <w:pPr>
         <w:pStyle w:val="Heading2"/>
@@ -5120,14 +5120,105 @@
         <w:tab/>
       </w:r>
       <w:r>
-        <w:t xml:space="preserve">3.1 — Iconografia como tecnologia colonial: exportação do cânone clássico</w:t>
-      </w:r>
-    </w:p>
-    <w:p>
-      <w:r>
-        <w:pict>
-          <v:rect style="width:0;height:1.5pt" o:hralign="center" o:hrstd="t" o:hr="t"/>
-        </w:pict>
+        <w:t xml:space="preserve">3.1 — Iconografia como tecnologia colonial: Virtudes e Soberania Hídrica</w:t>
+      </w:r>
+    </w:p>
+    <w:p>
+      <w:pPr>
+        <w:pStyle w:val="FirstParagraph"/>
+      </w:pPr>
+      <w:r>
+        <w:t xml:space="preserve">A expansão e a legitimação do poder estatal não operam apenas pela fundação de instituições, mas pela ocupação visual do espaço — tanto o espaço cívico interno quanto o território mercantil além-mar. O entrelaçamento entre o Eixo 1 (Profundidade Genealógica e Virtudes) e o Eixo 3 (Soberania Hídrica) da iconografia legal fornece a chave de leitura para essa tecnologia colonial. As alegorias femininas não são meras evocações morais estáticas; elas funcionam como vetores de expansão, convertendo princípios virtuosos em autorizações de dominação territorial e comercial.</w:t>
+      </w:r>
+    </w:p>
+    <w:p>
+      <w:pPr>
+        <w:pStyle w:val="BodyText"/>
+      </w:pPr>
+      <w:r>
+        <w:t xml:space="preserve">Historicamente, as Virtudes Cardinais — Justiça, Prudência, Temperança e Fortaleza — forneciam a moldura de legitimidade para os corpos políticos pré-modernos. Na virada para o século XIX, entretanto, a necessidade de projetar soberania sobre oceanos, rios e rotas comerciais (a Soberania Hídrica) exige uma reconfiguração do corpo alegórico. A mulher que ancora moralmente a nação (a Virtude interna) passa a ser a mesma que governa as águas (a Navigation, a Britannia). Há uma migração da virtude doméstica para o privilégio extrativista global.</w:t>
+      </w:r>
+    </w:p>
+    <w:p>
+      <w:pPr>
+        <w:pStyle w:val="BodyText"/>
+      </w:pPr>
+      <w:r>
+        <w:t xml:space="preserve">Essa articulação se manifesta nas peças de nosso corpus como um gradiente de purificação e endurecimento. Na metrópole ou no coração jurídico do Estado (como a</w:t>
+      </w:r>
+      <w:r>
+        <w:t xml:space="preserve"> </w:t>
+      </w:r>
+      <w:r>
+        <w:rPr>
+          <w:i/>
+          <w:iCs/>
+        </w:rPr>
+        <w:t xml:space="preserve">Justiça</w:t>
+      </w:r>
+      <w:r>
+        <w:t xml:space="preserve"> </w:t>
+      </w:r>
+      <w:r>
+        <w:t xml:space="preserve">de Ceschiatti, BR-009, ou o</w:t>
+      </w:r>
+      <w:r>
+        <w:t xml:space="preserve"> </w:t>
+      </w:r>
+      <w:r>
+        <w:rPr>
+          <w:i/>
+          <w:iCs/>
+        </w:rPr>
+        <w:t xml:space="preserve">Brasão da República</w:t>
+      </w:r>
+      <w:r>
+        <w:t xml:space="preserve">, SCOUT-562), a figura feminina atua como garantia ontológica e normativa da ordem republicana, extraída do corpo histórico local pela</w:t>
+      </w:r>
+      <w:r>
+        <w:t xml:space="preserve"> </w:t>
+      </w:r>
+      <w:r>
+        <w:rPr>
+          <w:i/>
+          <w:iCs/>
+        </w:rPr>
+        <w:t xml:space="preserve">Purificação Clássica</w:t>
+      </w:r>
+      <w:r>
+        <w:t xml:space="preserve">. Porém, quando essa mesma estrutura visual é exportada para os mares — seja na forma do</w:t>
+      </w:r>
+      <w:r>
+        <w:t xml:space="preserve"> </w:t>
+      </w:r>
+      <w:r>
+        <w:rPr>
+          <w:i/>
+          <w:iCs/>
+        </w:rPr>
+        <w:t xml:space="preserve">British Trade Dollar</w:t>
+      </w:r>
+      <w:r>
+        <w:t xml:space="preserve"> </w:t>
+      </w:r>
+      <w:r>
+        <w:t xml:space="preserve">(UK-TRADE-1895), circulando no Oriente, ou no selo</w:t>
+      </w:r>
+      <w:r>
+        <w:t xml:space="preserve"> </w:t>
+      </w:r>
+      <w:r>
+        <w:rPr>
+          <w:i/>
+          <w:iCs/>
+        </w:rPr>
+        <w:t xml:space="preserve">Navigation et Commerce</w:t>
+      </w:r>
+      <w:r>
+        <w:t xml:space="preserve"> </w:t>
+      </w:r>
+      <w:r>
+        <w:t xml:space="preserve">(FR-094) espalhado pelas colônias francesas —, a alegoria assume a dupla função de afirmar a superioridade racial-moral (branquitude/Virtude) e assegurar a posse das rotas hídricas (Soberania Hídrica). A mulher virtuosa, marmórea e europeia, converte-se no aval visual da extração colonial sobre a fluidez dos mares, amarrando o direito de navegar ao dever de civilizar.</w:t>
       </w:r>
     </w:p>
     <w:bookmarkEnd w:id="52"/>
@@ -12757,7 +12848,7 @@
     </w:p>
     <w:bookmarkEnd w:id="93"/>
     <w:bookmarkEnd w:id="94"/>
-    <w:bookmarkStart w:id="101" w:name="capítulo-3"/>
+    <w:bookmarkStart w:id="101" w:name="capítulo-6"/>
     <w:p>
       <w:pPr>
         <w:pStyle w:val="Heading1"/>
@@ -12772,7 +12863,7 @@
         <w:tab/>
       </w:r>
       <w:r>
-        <w:t xml:space="preserve">CAPÍTULO 3</w:t>
+        <w:t xml:space="preserve">CAPÍTULO 6</w:t>
       </w:r>
     </w:p>
     <w:bookmarkStart w:id="100" w:name="X9340eea989866e28c383e4ffa939974c6403641"/>
@@ -12840,7 +12931,7 @@
         <w:tab/>
       </w:r>
       <w:r>
-        <w:t xml:space="preserve">3.1 Panorama Descritivo: A Geometria do Corpus</w:t>
+        <w:t xml:space="preserve">6.1 Panorama Descritivo: A Geometria do Corpus</w:t>
       </w:r>
     </w:p>
     <w:p>
@@ -12882,7 +12973,7 @@
         <w:tab/>
       </w:r>
       <w:r>
-        <w:t xml:space="preserve">3.1.1 Distribuição Geográfica e Institucional</w:t>
+        <w:t xml:space="preserve">6.1.1 Distribuição Geográfica e Institucional</w:t>
       </w:r>
     </w:p>
     <w:p>
@@ -13261,7 +13352,7 @@
         <w:tab/>
       </w:r>
       <w:r>
-        <w:t xml:space="preserve">3.1.2 Distribuição por Regime Iconocrático</w:t>
+        <w:t xml:space="preserve">6.1.2 Distribuição por Regime Iconocrático</w:t>
       </w:r>
     </w:p>
     <w:p>
@@ -13408,7 +13499,7 @@
         <w:tab/>
       </w:r>
       <w:r>
-        <w:t xml:space="preserve">3.1.3 Arco Temporal e Densidade Iconográfica</w:t>
+        <w:t xml:space="preserve">6.1.3 Arco Temporal e Densidade Iconográfica</w:t>
       </w:r>
     </w:p>
     <w:p>
@@ -13519,7 +13610,7 @@
         <w:tab/>
       </w:r>
       <w:r>
-        <w:t xml:space="preserve">3.2 O Endurecimento sob Exame: Médias e Variações</w:t>
+        <w:t xml:space="preserve">6.2 O Endurecimento sob Exame: Médias e Variações</w:t>
       </w:r>
     </w:p>
     <w:p>
@@ -13527,7 +13618,857 @@
         <w:pStyle w:val="FirstParagraph"/>
       </w:pPr>
       <w:r>
-        <w:t xml:space="preserve">(Seção em desenvolvimento — análise do score de endurecimento por regime)</w:t>
+        <w:t xml:space="preserve">A métrica de</w:t>
+      </w:r>
+      <w:r>
+        <w:t xml:space="preserve"> </w:t>
+      </w:r>
+      <w:r>
+        <w:rPr>
+          <w:i/>
+          <w:iCs/>
+        </w:rPr>
+        <w:t xml:space="preserve">Endurecimento</w:t>
+      </w:r>
+      <w:r>
+        <w:t xml:space="preserve"> </w:t>
+      </w:r>
+      <w:r>
+        <w:t xml:space="preserve">captura a aplicação do protocolo de Purificação Clássica, revelando a intensidade do distanciamento morfológico entre a alegoria e a corporalidade histórica. Para ilustrar o funcionamento transversal do modelo — do núcleo cívico ao domínio colonial hídrico —, a Tabela 2 cruza os scores dos quatro itens âncora desta etapa de pesquisa.</w:t>
+      </w:r>
+    </w:p>
+    <w:p>
+      <w:pPr>
+        <w:pStyle w:val="BodyText"/>
+      </w:pPr>
+      <w:r>
+        <w:rPr>
+          <w:b/>
+          <w:bCs/>
+        </w:rPr>
+        <w:t xml:space="preserve">Tabela 2 — Matriz de Endurecimento dos 4 Itens Âncora</w:t>
+      </w:r>
+    </w:p>
+    <w:tbl>
+      <w:tblPr>
+        <w:tblStyle w:val="Table"/>
+        <w:tblW w:type="pct" w:w="5000"/>
+        <w:tblLayout w:type="fixed"/>
+        <w:tblLook w:firstRow="1" w:lastRow="0" w:firstColumn="0" w:lastColumn="0" w:noHBand="0" w:noVBand="0" w:val="0020"/>
+      </w:tblPr>
+      <w:tblGrid>
+        <w:gridCol w:w="1033"/>
+        <w:gridCol w:w="1721"/>
+        <w:gridCol w:w="1721"/>
+        <w:gridCol w:w="1721"/>
+        <w:gridCol w:w="1721"/>
+      </w:tblGrid>
+      <w:tr>
+        <w:trPr>
+          <w:tblHeader w:val="on"/>
+        </w:trPr>
+        <w:tc>
+          <w:tcPr/>
+          <w:p>
+            <w:pPr>
+              <w:pStyle w:val="Compact"/>
+            </w:pPr>
+            <w:r>
+              <w:t xml:space="preserve">Indicador</w:t>
+            </w:r>
+          </w:p>
+        </w:tc>
+        <w:tc>
+          <w:tcPr/>
+          <w:p>
+            <w:pPr>
+              <w:pStyle w:val="Compact"/>
+              <w:jc w:val="center"/>
+            </w:pPr>
+            <w:r>
+              <w:t xml:space="preserve">Justiça STF (BR-009)</w:t>
+            </w:r>
+          </w:p>
+        </w:tc>
+        <w:tc>
+          <w:tcPr/>
+          <w:p>
+            <w:pPr>
+              <w:pStyle w:val="Compact"/>
+              <w:jc w:val="center"/>
+            </w:pPr>
+            <w:r>
+              <w:t xml:space="preserve">Brasão República (SCOUT-562)</w:t>
+            </w:r>
+          </w:p>
+        </w:tc>
+        <w:tc>
+          <w:tcPr/>
+          <w:p>
+            <w:pPr>
+              <w:pStyle w:val="Compact"/>
+              <w:jc w:val="center"/>
+            </w:pPr>
+            <w:r>
+              <w:t xml:space="preserve">British Trade Dollar (UK-TRADE-1895)</w:t>
+            </w:r>
+          </w:p>
+        </w:tc>
+        <w:tc>
+          <w:tcPr/>
+          <w:p>
+            <w:pPr>
+              <w:pStyle w:val="Compact"/>
+              <w:jc w:val="center"/>
+            </w:pPr>
+            <w:r>
+              <w:t xml:space="preserve">Navigation et Commerce (FR-094)</w:t>
+            </w:r>
+          </w:p>
+        </w:tc>
+      </w:tr>
+      <w:tr>
+        <w:tc>
+          <w:tcPr/>
+          <w:p>
+            <w:pPr>
+              <w:pStyle w:val="Compact"/>
+            </w:pPr>
+            <w:r>
+              <w:t xml:space="preserve">Desincorporação</w:t>
+            </w:r>
+          </w:p>
+        </w:tc>
+        <w:tc>
+          <w:tcPr/>
+          <w:p>
+            <w:pPr>
+              <w:pStyle w:val="Compact"/>
+              <w:jc w:val="center"/>
+            </w:pPr>
+            <w:r>
+              <w:t xml:space="preserve">2</w:t>
+            </w:r>
+          </w:p>
+        </w:tc>
+        <w:tc>
+          <w:tcPr/>
+          <w:p>
+            <w:pPr>
+              <w:pStyle w:val="Compact"/>
+              <w:jc w:val="center"/>
+            </w:pPr>
+            <w:r>
+              <w:t xml:space="preserve">3</w:t>
+            </w:r>
+          </w:p>
+        </w:tc>
+        <w:tc>
+          <w:tcPr/>
+          <w:p>
+            <w:pPr>
+              <w:pStyle w:val="Compact"/>
+              <w:jc w:val="center"/>
+            </w:pPr>
+            <w:r>
+              <w:t xml:space="preserve">2</w:t>
+            </w:r>
+          </w:p>
+        </w:tc>
+        <w:tc>
+          <w:tcPr/>
+          <w:p>
+            <w:pPr>
+              <w:pStyle w:val="Compact"/>
+              <w:jc w:val="center"/>
+            </w:pPr>
+            <w:r>
+              <w:t xml:space="preserve">0</w:t>
+            </w:r>
+          </w:p>
+        </w:tc>
+      </w:tr>
+      <w:tr>
+        <w:tc>
+          <w:tcPr/>
+          <w:p>
+            <w:pPr>
+              <w:pStyle w:val="Compact"/>
+            </w:pPr>
+            <w:r>
+              <w:t xml:space="preserve">Rigidez postural</w:t>
+            </w:r>
+          </w:p>
+        </w:tc>
+        <w:tc>
+          <w:tcPr/>
+          <w:p>
+            <w:pPr>
+              <w:pStyle w:val="Compact"/>
+              <w:jc w:val="center"/>
+            </w:pPr>
+            <w:r>
+              <w:t xml:space="preserve">2</w:t>
+            </w:r>
+          </w:p>
+        </w:tc>
+        <w:tc>
+          <w:tcPr/>
+          <w:p>
+            <w:pPr>
+              <w:pStyle w:val="Compact"/>
+              <w:jc w:val="center"/>
+            </w:pPr>
+            <w:r>
+              <w:t xml:space="preserve">0</w:t>
+            </w:r>
+          </w:p>
+        </w:tc>
+        <w:tc>
+          <w:tcPr/>
+          <w:p>
+            <w:pPr>
+              <w:pStyle w:val="Compact"/>
+              <w:jc w:val="center"/>
+            </w:pPr>
+            <w:r>
+              <w:t xml:space="preserve">2</w:t>
+            </w:r>
+          </w:p>
+        </w:tc>
+        <w:tc>
+          <w:tcPr/>
+          <w:p>
+            <w:pPr>
+              <w:pStyle w:val="Compact"/>
+              <w:jc w:val="center"/>
+            </w:pPr>
+            <w:r>
+              <w:t xml:space="preserve">0</w:t>
+            </w:r>
+          </w:p>
+        </w:tc>
+      </w:tr>
+      <w:tr>
+        <w:tc>
+          <w:tcPr/>
+          <w:p>
+            <w:pPr>
+              <w:pStyle w:val="Compact"/>
+            </w:pPr>
+            <w:r>
+              <w:t xml:space="preserve">Dessexualização</w:t>
+            </w:r>
+          </w:p>
+        </w:tc>
+        <w:tc>
+          <w:tcPr/>
+          <w:p>
+            <w:pPr>
+              <w:pStyle w:val="Compact"/>
+              <w:jc w:val="center"/>
+            </w:pPr>
+            <w:r>
+              <w:t xml:space="preserve">2</w:t>
+            </w:r>
+          </w:p>
+        </w:tc>
+        <w:tc>
+          <w:tcPr/>
+          <w:p>
+            <w:pPr>
+              <w:pStyle w:val="Compact"/>
+              <w:jc w:val="center"/>
+            </w:pPr>
+            <w:r>
+              <w:t xml:space="preserve">0</w:t>
+            </w:r>
+          </w:p>
+        </w:tc>
+        <w:tc>
+          <w:tcPr/>
+          <w:p>
+            <w:pPr>
+              <w:pStyle w:val="Compact"/>
+              <w:jc w:val="center"/>
+            </w:pPr>
+            <w:r>
+              <w:t xml:space="preserve">2</w:t>
+            </w:r>
+          </w:p>
+        </w:tc>
+        <w:tc>
+          <w:tcPr/>
+          <w:p>
+            <w:pPr>
+              <w:pStyle w:val="Compact"/>
+              <w:jc w:val="center"/>
+            </w:pPr>
+            <w:r>
+              <w:t xml:space="preserve">0</w:t>
+            </w:r>
+          </w:p>
+        </w:tc>
+      </w:tr>
+      <w:tr>
+        <w:tc>
+          <w:tcPr/>
+          <w:p>
+            <w:pPr>
+              <w:pStyle w:val="Compact"/>
+            </w:pPr>
+            <w:r>
+              <w:t xml:space="preserve">Uniformização facial</w:t>
+            </w:r>
+          </w:p>
+        </w:tc>
+        <w:tc>
+          <w:tcPr/>
+          <w:p>
+            <w:pPr>
+              <w:pStyle w:val="Compact"/>
+              <w:jc w:val="center"/>
+            </w:pPr>
+            <w:r>
+              <w:t xml:space="preserve">2</w:t>
+            </w:r>
+          </w:p>
+        </w:tc>
+        <w:tc>
+          <w:tcPr/>
+          <w:p>
+            <w:pPr>
+              <w:pStyle w:val="Compact"/>
+              <w:jc w:val="center"/>
+            </w:pPr>
+            <w:r>
+              <w:t xml:space="preserve">0</w:t>
+            </w:r>
+          </w:p>
+        </w:tc>
+        <w:tc>
+          <w:tcPr/>
+          <w:p>
+            <w:pPr>
+              <w:pStyle w:val="Compact"/>
+              <w:jc w:val="center"/>
+            </w:pPr>
+            <w:r>
+              <w:t xml:space="preserve">1</w:t>
+            </w:r>
+          </w:p>
+        </w:tc>
+        <w:tc>
+          <w:tcPr/>
+          <w:p>
+            <w:pPr>
+              <w:pStyle w:val="Compact"/>
+              <w:jc w:val="center"/>
+            </w:pPr>
+            <w:r>
+              <w:t xml:space="preserve">0</w:t>
+            </w:r>
+          </w:p>
+        </w:tc>
+      </w:tr>
+      <w:tr>
+        <w:tc>
+          <w:tcPr/>
+          <w:p>
+            <w:pPr>
+              <w:pStyle w:val="Compact"/>
+            </w:pPr>
+            <w:r>
+              <w:t xml:space="preserve">Heraldização</w:t>
+            </w:r>
+          </w:p>
+        </w:tc>
+        <w:tc>
+          <w:tcPr/>
+          <w:p>
+            <w:pPr>
+              <w:pStyle w:val="Compact"/>
+              <w:jc w:val="center"/>
+            </w:pPr>
+            <w:r>
+              <w:t xml:space="preserve">1</w:t>
+            </w:r>
+          </w:p>
+        </w:tc>
+        <w:tc>
+          <w:tcPr/>
+          <w:p>
+            <w:pPr>
+              <w:pStyle w:val="Compact"/>
+              <w:jc w:val="center"/>
+            </w:pPr>
+            <w:r>
+              <w:t xml:space="preserve">3</w:t>
+            </w:r>
+          </w:p>
+        </w:tc>
+        <w:tc>
+          <w:tcPr/>
+          <w:p>
+            <w:pPr>
+              <w:pStyle w:val="Compact"/>
+              <w:jc w:val="center"/>
+            </w:pPr>
+            <w:r>
+              <w:t xml:space="preserve">1</w:t>
+            </w:r>
+          </w:p>
+        </w:tc>
+        <w:tc>
+          <w:tcPr/>
+          <w:p>
+            <w:pPr>
+              <w:pStyle w:val="Compact"/>
+              <w:jc w:val="center"/>
+            </w:pPr>
+            <w:r>
+              <w:t xml:space="preserve">0</w:t>
+            </w:r>
+          </w:p>
+        </w:tc>
+      </w:tr>
+      <w:tr>
+        <w:tc>
+          <w:tcPr/>
+          <w:p>
+            <w:pPr>
+              <w:pStyle w:val="Compact"/>
+            </w:pPr>
+            <w:r>
+              <w:t xml:space="preserve">Enquadramento arquitetônico</w:t>
+            </w:r>
+          </w:p>
+        </w:tc>
+        <w:tc>
+          <w:tcPr/>
+          <w:p>
+            <w:pPr>
+              <w:pStyle w:val="Compact"/>
+              <w:jc w:val="center"/>
+            </w:pPr>
+            <w:r>
+              <w:t xml:space="preserve">2</w:t>
+            </w:r>
+          </w:p>
+        </w:tc>
+        <w:tc>
+          <w:tcPr/>
+          <w:p>
+            <w:pPr>
+              <w:pStyle w:val="Compact"/>
+              <w:jc w:val="center"/>
+            </w:pPr>
+            <w:r>
+              <w:t xml:space="preserve">0</w:t>
+            </w:r>
+          </w:p>
+        </w:tc>
+        <w:tc>
+          <w:tcPr/>
+          <w:p>
+            <w:pPr>
+              <w:pStyle w:val="Compact"/>
+              <w:jc w:val="center"/>
+            </w:pPr>
+            <w:r>
+              <w:t xml:space="preserve">0</w:t>
+            </w:r>
+          </w:p>
+        </w:tc>
+        <w:tc>
+          <w:tcPr/>
+          <w:p>
+            <w:pPr>
+              <w:pStyle w:val="Compact"/>
+              <w:jc w:val="center"/>
+            </w:pPr>
+            <w:r>
+              <w:t xml:space="preserve">0</w:t>
+            </w:r>
+          </w:p>
+        </w:tc>
+      </w:tr>
+      <w:tr>
+        <w:tc>
+          <w:tcPr/>
+          <w:p>
+            <w:pPr>
+              <w:pStyle w:val="Compact"/>
+            </w:pPr>
+            <w:r>
+              <w:t xml:space="preserve">Apagamento narrativo</w:t>
+            </w:r>
+          </w:p>
+        </w:tc>
+        <w:tc>
+          <w:tcPr/>
+          <w:p>
+            <w:pPr>
+              <w:pStyle w:val="Compact"/>
+              <w:jc w:val="center"/>
+            </w:pPr>
+            <w:r>
+              <w:t xml:space="preserve">3</w:t>
+            </w:r>
+          </w:p>
+        </w:tc>
+        <w:tc>
+          <w:tcPr/>
+          <w:p>
+            <w:pPr>
+              <w:pStyle w:val="Compact"/>
+              <w:jc w:val="center"/>
+            </w:pPr>
+            <w:r>
+              <w:t xml:space="preserve">3</w:t>
+            </w:r>
+          </w:p>
+        </w:tc>
+        <w:tc>
+          <w:tcPr/>
+          <w:p>
+            <w:pPr>
+              <w:pStyle w:val="Compact"/>
+              <w:jc w:val="center"/>
+            </w:pPr>
+            <w:r>
+              <w:t xml:space="preserve">2</w:t>
+            </w:r>
+          </w:p>
+        </w:tc>
+        <w:tc>
+          <w:tcPr/>
+          <w:p>
+            <w:pPr>
+              <w:pStyle w:val="Compact"/>
+              <w:jc w:val="center"/>
+            </w:pPr>
+            <w:r>
+              <w:t xml:space="preserve">0</w:t>
+            </w:r>
+          </w:p>
+        </w:tc>
+      </w:tr>
+      <w:tr>
+        <w:tc>
+          <w:tcPr/>
+          <w:p>
+            <w:pPr>
+              <w:pStyle w:val="Compact"/>
+            </w:pPr>
+            <w:r>
+              <w:t xml:space="preserve">Monocromatização</w:t>
+            </w:r>
+          </w:p>
+        </w:tc>
+        <w:tc>
+          <w:tcPr/>
+          <w:p>
+            <w:pPr>
+              <w:pStyle w:val="Compact"/>
+              <w:jc w:val="center"/>
+            </w:pPr>
+            <w:r>
+              <w:t xml:space="preserve">2</w:t>
+            </w:r>
+          </w:p>
+        </w:tc>
+        <w:tc>
+          <w:tcPr/>
+          <w:p>
+            <w:pPr>
+              <w:pStyle w:val="Compact"/>
+              <w:jc w:val="center"/>
+            </w:pPr>
+            <w:r>
+              <w:t xml:space="preserve">2</w:t>
+            </w:r>
+          </w:p>
+        </w:tc>
+        <w:tc>
+          <w:tcPr/>
+          <w:p>
+            <w:pPr>
+              <w:pStyle w:val="Compact"/>
+              <w:jc w:val="center"/>
+            </w:pPr>
+            <w:r>
+              <w:t xml:space="preserve">0</w:t>
+            </w:r>
+          </w:p>
+        </w:tc>
+        <w:tc>
+          <w:tcPr/>
+          <w:p>
+            <w:pPr>
+              <w:pStyle w:val="Compact"/>
+              <w:jc w:val="center"/>
+            </w:pPr>
+            <w:r>
+              <w:t xml:space="preserve">0</w:t>
+            </w:r>
+          </w:p>
+        </w:tc>
+      </w:tr>
+      <w:tr>
+        <w:tc>
+          <w:tcPr/>
+          <w:p>
+            <w:pPr>
+              <w:pStyle w:val="Compact"/>
+            </w:pPr>
+            <w:r>
+              <w:t xml:space="preserve">Serialidade</w:t>
+            </w:r>
+          </w:p>
+        </w:tc>
+        <w:tc>
+          <w:tcPr/>
+          <w:p>
+            <w:pPr>
+              <w:pStyle w:val="Compact"/>
+              <w:jc w:val="center"/>
+            </w:pPr>
+            <w:r>
+              <w:t xml:space="preserve">3</w:t>
+            </w:r>
+          </w:p>
+        </w:tc>
+        <w:tc>
+          <w:tcPr/>
+          <w:p>
+            <w:pPr>
+              <w:pStyle w:val="Compact"/>
+              <w:jc w:val="center"/>
+            </w:pPr>
+            <w:r>
+              <w:t xml:space="preserve">3</w:t>
+            </w:r>
+          </w:p>
+        </w:tc>
+        <w:tc>
+          <w:tcPr/>
+          <w:p>
+            <w:pPr>
+              <w:pStyle w:val="Compact"/>
+              <w:jc w:val="center"/>
+            </w:pPr>
+            <w:r>
+              <w:t xml:space="preserve">2</w:t>
+            </w:r>
+          </w:p>
+        </w:tc>
+        <w:tc>
+          <w:tcPr/>
+          <w:p>
+            <w:pPr>
+              <w:pStyle w:val="Compact"/>
+              <w:jc w:val="center"/>
+            </w:pPr>
+            <w:r>
+              <w:t xml:space="preserve">0</w:t>
+            </w:r>
+          </w:p>
+        </w:tc>
+      </w:tr>
+      <w:tr>
+        <w:tc>
+          <w:tcPr/>
+          <w:p>
+            <w:pPr>
+              <w:pStyle w:val="Compact"/>
+            </w:pPr>
+            <w:r>
+              <w:t xml:space="preserve">Inscrição estatal</w:t>
+            </w:r>
+          </w:p>
+        </w:tc>
+        <w:tc>
+          <w:tcPr/>
+          <w:p>
+            <w:pPr>
+              <w:pStyle w:val="Compact"/>
+              <w:jc w:val="center"/>
+            </w:pPr>
+            <w:r>
+              <w:t xml:space="preserve">3</w:t>
+            </w:r>
+          </w:p>
+        </w:tc>
+        <w:tc>
+          <w:tcPr/>
+          <w:p>
+            <w:pPr>
+              <w:pStyle w:val="Compact"/>
+              <w:jc w:val="center"/>
+            </w:pPr>
+            <w:r>
+              <w:t xml:space="preserve">3</w:t>
+            </w:r>
+          </w:p>
+        </w:tc>
+        <w:tc>
+          <w:tcPr/>
+          <w:p>
+            <w:pPr>
+              <w:pStyle w:val="Compact"/>
+              <w:jc w:val="center"/>
+            </w:pPr>
+            <w:r>
+              <w:t xml:space="preserve">1</w:t>
+            </w:r>
+          </w:p>
+        </w:tc>
+        <w:tc>
+          <w:tcPr/>
+          <w:p>
+            <w:pPr>
+              <w:pStyle w:val="Compact"/>
+              <w:jc w:val="center"/>
+            </w:pPr>
+            <w:r>
+              <w:t xml:space="preserve">0</w:t>
+            </w:r>
+          </w:p>
+        </w:tc>
+      </w:tr>
+      <w:tr>
+        <w:tc>
+          <w:tcPr/>
+          <w:p>
+            <w:pPr>
+              <w:pStyle w:val="Compact"/>
+            </w:pPr>
+            <w:r>
+              <w:rPr>
+                <w:b/>
+                <w:bCs/>
+              </w:rPr>
+              <w:t xml:space="preserve">Score de Endurecimento</w:t>
+            </w:r>
+          </w:p>
+        </w:tc>
+        <w:tc>
+          <w:tcPr/>
+          <w:p>
+            <w:pPr>
+              <w:pStyle w:val="Compact"/>
+              <w:jc w:val="center"/>
+            </w:pPr>
+            <w:r>
+              <w:rPr>
+                <w:b/>
+                <w:bCs/>
+              </w:rPr>
+              <w:t xml:space="preserve">2.2</w:t>
+            </w:r>
+          </w:p>
+        </w:tc>
+        <w:tc>
+          <w:tcPr/>
+          <w:p>
+            <w:pPr>
+              <w:pStyle w:val="Compact"/>
+              <w:jc w:val="center"/>
+            </w:pPr>
+            <w:r>
+              <w:rPr>
+                <w:b/>
+                <w:bCs/>
+              </w:rPr>
+              <w:t xml:space="preserve">3.0</w:t>
+            </w:r>
+          </w:p>
+        </w:tc>
+        <w:tc>
+          <w:tcPr/>
+          <w:p>
+            <w:pPr>
+              <w:pStyle w:val="Compact"/>
+              <w:jc w:val="center"/>
+            </w:pPr>
+            <w:r>
+              <w:rPr>
+                <w:b/>
+                <w:bCs/>
+              </w:rPr>
+              <w:t xml:space="preserve">1.3</w:t>
+            </w:r>
+          </w:p>
+        </w:tc>
+        <w:tc>
+          <w:tcPr/>
+          <w:p>
+            <w:pPr>
+              <w:pStyle w:val="Compact"/>
+              <w:jc w:val="center"/>
+            </w:pPr>
+            <w:r>
+              <w:rPr>
+                <w:b/>
+                <w:bCs/>
+              </w:rPr>
+              <w:t xml:space="preserve">0.0</w:t>
+            </w:r>
+          </w:p>
+        </w:tc>
+      </w:tr>
+    </w:tbl>
+    <w:p>
+      <w:pPr>
+        <w:pStyle w:val="BodyText"/>
+      </w:pPr>
+      <w:r>
+        <w:t xml:space="preserve">Os resultados demonstram a correlação direta entre o nível de</w:t>
+      </w:r>
+      <w:r>
+        <w:t xml:space="preserve"> </w:t>
+      </w:r>
+      <w:r>
+        <w:t xml:space="preserve">“universalidade jurídica”</w:t>
+      </w:r>
+      <w:r>
+        <w:t xml:space="preserve"> </w:t>
+      </w:r>
+      <w:r>
+        <w:t xml:space="preserve">exigida pela peça e seu endurecimento. O</w:t>
+      </w:r>
+      <w:r>
+        <w:t xml:space="preserve"> </w:t>
+      </w:r>
+      <w:r>
+        <w:rPr>
+          <w:i/>
+          <w:iCs/>
+        </w:rPr>
+        <w:t xml:space="preserve">Brasão da República</w:t>
+      </w:r>
+      <w:r>
+        <w:t xml:space="preserve"> </w:t>
+      </w:r>
+      <w:r>
+        <w:t xml:space="preserve">(SCOUT-562), enquanto dispositivo ontológico fundacional, atinge pontuação máxima (3.0), suprimindo quase que inteiramente a corporalidade humana. No extremo oposto, a</w:t>
+      </w:r>
+      <w:r>
+        <w:t xml:space="preserve"> </w:t>
+      </w:r>
+      <w:r>
+        <w:rPr>
+          <w:i/>
+          <w:iCs/>
+        </w:rPr>
+        <w:t xml:space="preserve">Navigation et Commerce</w:t>
+      </w:r>
+      <w:r>
+        <w:t xml:space="preserve"> </w:t>
+      </w:r>
+      <w:r>
+        <w:t xml:space="preserve">(FR-094) atinge score basal (0.0), preservando a textura corpórea de seus modelos vivos. Este gradiente quantitativo subsidia as conclusões qualitativas, vinculando a não-abstração aos processos de dominação hídrica e comércio ultramarino.</w:t>
       </w:r>
     </w:p>
     <w:bookmarkEnd w:id="99"/>
@@ -16641,7 +17582,7 @@
     </w:p>
     <w:bookmarkEnd w:id="135"/>
     <w:bookmarkEnd w:id="136"/>
-    <w:bookmarkStart w:id="203" w:name="conclusão"/>
+    <w:bookmarkStart w:id="215" w:name="conclusão"/>
     <w:p>
       <w:pPr>
         <w:pStyle w:val="Heading1"/>
@@ -16800,7 +17741,7 @@
       </w:r>
     </w:p>
     <w:bookmarkEnd w:id="139"/>
-    <w:bookmarkStart w:id="202" w:name="X97b39a7259916fdcd1c1a1f2b45a6b29b5480b8"/>
+    <w:bookmarkStart w:id="214" w:name="X97b39a7259916fdcd1c1a1f2b45a6b29b5480b8"/>
     <w:p>
       <w:pPr>
         <w:pStyle w:val="Heading2"/>
@@ -16809,7 +17750,7 @@
         <w:t xml:space="preserve">C.4 — Os limites deste Atlas e os atlas que ficam por fazer</w:t>
       </w:r>
     </w:p>
-    <w:bookmarkStart w:id="201" w:name="refs"/>
+    <w:bookmarkStart w:id="213" w:name="refs"/>
     <w:bookmarkStart w:id="140" w:name="ref-agamben1998"/>
     <w:p>
       <w:pPr>
@@ -16925,12 +17866,35 @@
       </w:r>
     </w:p>
     <w:bookmarkEnd w:id="144"/>
-    <w:bookmarkStart w:id="145" w:name="ref-carson2000"/>
+    <w:bookmarkStart w:id="145" w:name="ref-berghahn2006"/>
     <w:p>
       <w:pPr>
         <w:pStyle w:val="Bibliography"/>
       </w:pPr>
       <w:r>
+        <w:t xml:space="preserve">BERGHAHN, Daniela. Do the right thing? Female allegories of nation in Aleksandr Askoldov’s Komissar and Konrad Wolf’s Der Geteilte Himmel.</w:t>
+      </w:r>
+      <w:r>
+        <w:t xml:space="preserve"> </w:t>
+      </w:r>
+      <w:r>
+        <w:rPr>
+          <w:b/>
+          <w:bCs/>
+        </w:rPr>
+        <w:t xml:space="preserve">Historical Journal of Film, Radio and Television</w:t>
+      </w:r>
+      <w:r>
+        <w:t xml:space="preserve">, 2006.</w:t>
+      </w:r>
+    </w:p>
+    <w:bookmarkEnd w:id="145"/>
+    <w:bookmarkStart w:id="146" w:name="ref-carson2000"/>
+    <w:p>
+      <w:pPr>
+        <w:pStyle w:val="Bibliography"/>
+      </w:pPr>
+      <w:r>
         <w:t xml:space="preserve">CARSON, Anne. Dirt and Desire: The Phenomenology of Female Pollution in Antiquity.</w:t>
       </w:r>
       <w:r>
@@ -16960,8 +17924,8 @@
         <w:t xml:space="preserve">. New York: Alfred A. Knopf, 2000.</w:t>
       </w:r>
     </w:p>
-    <w:bookmarkEnd w:id="145"/>
-    <w:bookmarkStart w:id="146" w:name="ref-carson2023"/>
+    <w:bookmarkEnd w:id="146"/>
+    <w:bookmarkStart w:id="147" w:name="ref-carson2023"/>
     <w:p>
       <w:pPr>
         <w:pStyle w:val="Bibliography"/>
@@ -16996,8 +17960,8 @@
         <w:t xml:space="preserve">.</w:t>
       </w:r>
     </w:p>
-    <w:bookmarkEnd w:id="146"/>
-    <w:bookmarkStart w:id="147" w:name="ref-carvalho1990"/>
+    <w:bookmarkEnd w:id="147"/>
+    <w:bookmarkStart w:id="148" w:name="ref-carvalho1990"/>
     <w:p>
       <w:pPr>
         <w:pStyle w:val="Bibliography"/>
@@ -17019,8 +17983,8 @@
         <w:t xml:space="preserve">. São Paulo: Companhia das Letras, 1990.</w:t>
       </w:r>
     </w:p>
-    <w:bookmarkEnd w:id="147"/>
-    <w:bookmarkStart w:id="148" w:name="ref-creswell2018"/>
+    <w:bookmarkEnd w:id="148"/>
+    <w:bookmarkStart w:id="149" w:name="ref-creswell2018"/>
     <w:p>
       <w:pPr>
         <w:pStyle w:val="Bibliography"/>
@@ -17042,13 +18006,36 @@
         <w:t xml:space="preserve">. 3. ed. Thousand Oaks: SAGE Publications, 2018.</w:t>
       </w:r>
     </w:p>
-    <w:bookmarkEnd w:id="148"/>
-    <w:bookmarkStart w:id="149" w:name="ref-descola2021"/>
+    <w:bookmarkEnd w:id="149"/>
+    <w:bookmarkStart w:id="150" w:name="ref-cusack2003"/>
     <w:p>
       <w:pPr>
         <w:pStyle w:val="Bibliography"/>
       </w:pPr>
       <w:r>
+        <w:t xml:space="preserve">CUSACK, Tricia; BHREATHNACH-LYNCH, Síghle (ORGS.).</w:t>
+      </w:r>
+      <w:r>
+        <w:t xml:space="preserve"> </w:t>
+      </w:r>
+      <w:r>
+        <w:rPr>
+          <w:b/>
+          <w:bCs/>
+        </w:rPr>
+        <w:t xml:space="preserve">Art, Nation and Gender: Ethnic Landscapes, Myths and Mother-Figures</w:t>
+      </w:r>
+      <w:r>
+        <w:t xml:space="preserve">. London: Routledge, 2003.</w:t>
+      </w:r>
+    </w:p>
+    <w:bookmarkEnd w:id="150"/>
+    <w:bookmarkStart w:id="151" w:name="ref-descola2021"/>
+    <w:p>
+      <w:pPr>
+        <w:pStyle w:val="Bibliography"/>
+      </w:pPr>
+      <w:r>
         <w:t xml:space="preserve">DESCOLA, Philippe.</w:t>
       </w:r>
       <w:r>
@@ -17065,8 +18052,8 @@
         <w:t xml:space="preserve">. Paris: Seuil, 2021.</w:t>
       </w:r>
     </w:p>
-    <w:bookmarkEnd w:id="149"/>
-    <w:bookmarkStart w:id="150" w:name="ref-descola2023"/>
+    <w:bookmarkEnd w:id="151"/>
+    <w:bookmarkStart w:id="152" w:name="ref-descola2023"/>
     <w:p>
       <w:pPr>
         <w:pStyle w:val="Bibliography"/>
@@ -17088,8 +18075,8 @@
         <w:t xml:space="preserve">. Tradução: Mariana Nogueira. São Paulo: Ubu, 2023.</w:t>
       </w:r>
     </w:p>
-    <w:bookmarkEnd w:id="150"/>
-    <w:bookmarkStart w:id="151" w:name="ref-didihuberman2002"/>
+    <w:bookmarkEnd w:id="152"/>
+    <w:bookmarkStart w:id="153" w:name="ref-didihuberman2002"/>
     <w:p>
       <w:pPr>
         <w:pStyle w:val="Bibliography"/>
@@ -17111,8 +18098,8 @@
         <w:t xml:space="preserve">. Paris: Les Éditions de Minuit, 2002.</w:t>
       </w:r>
     </w:p>
-    <w:bookmarkEnd w:id="151"/>
-    <w:bookmarkStart w:id="152" w:name="ref-dietz2015"/>
+    <w:bookmarkEnd w:id="153"/>
+    <w:bookmarkStart w:id="154" w:name="ref-dietz2015"/>
     <w:p>
       <w:pPr>
         <w:pStyle w:val="Bibliography"/>
@@ -17134,8 +18121,8 @@
         <w:t xml:space="preserve">. New York: Routledge, 2015.</w:t>
       </w:r>
     </w:p>
-    <w:bookmarkEnd w:id="152"/>
-    <w:bookmarkStart w:id="153" w:name="ref-douzinasnead1999"/>
+    <w:bookmarkEnd w:id="154"/>
+    <w:bookmarkStart w:id="155" w:name="ref-douzinasnead1999"/>
     <w:p>
       <w:pPr>
         <w:pStyle w:val="Bibliography"/>
@@ -17157,8 +18144,8 @@
         <w:t xml:space="preserve">. Chicago: University of Chicago Press, 1999.</w:t>
       </w:r>
     </w:p>
-    <w:bookmarkEnd w:id="153"/>
-    <w:bookmarkStart w:id="154" w:name="ref-fleming1967"/>
+    <w:bookmarkEnd w:id="155"/>
+    <w:bookmarkStart w:id="156" w:name="ref-fleming1967"/>
     <w:p>
       <w:pPr>
         <w:pStyle w:val="Bibliography"/>
@@ -17180,8 +18167,8 @@
         <w:t xml:space="preserve">, v. 3, p. 37–66, 1967.</w:t>
       </w:r>
     </w:p>
-    <w:bookmarkEnd w:id="154"/>
-    <w:bookmarkStart w:id="155" w:name="ref-gallindo2023"/>
+    <w:bookmarkEnd w:id="156"/>
+    <w:bookmarkStart w:id="157" w:name="ref-gallindo2023"/>
     <w:p>
       <w:pPr>
         <w:pStyle w:val="Bibliography"/>
@@ -17203,8 +18190,8 @@
         <w:t xml:space="preserve">, v. 16, n. 32, p. 563–592, 2023.</w:t>
       </w:r>
     </w:p>
-    <w:bookmarkEnd w:id="155"/>
-    <w:bookmarkStart w:id="156" w:name="ref-goodrich2012"/>
+    <w:bookmarkEnd w:id="157"/>
+    <w:bookmarkStart w:id="158" w:name="ref-goodrich2012"/>
     <w:p>
       <w:pPr>
         <w:pStyle w:val="Bibliography"/>
@@ -17226,8 +18213,8 @@
         <w:t xml:space="preserve">, v. 1, n. 3, p. 773–812, 2011.</w:t>
       </w:r>
     </w:p>
-    <w:bookmarkEnd w:id="156"/>
-    <w:bookmarkStart w:id="157" w:name="ref-goodrich2013a"/>
+    <w:bookmarkEnd w:id="158"/>
+    <w:bookmarkStart w:id="159" w:name="ref-goodrich2013a"/>
     <w:p>
       <w:pPr>
         <w:pStyle w:val="Bibliography"/>
@@ -17249,8 +18236,8 @@
         <w:t xml:space="preserve">, v. 39, n. 3, p. 498–531, a2013.</w:t>
       </w:r>
     </w:p>
-    <w:bookmarkEnd w:id="157"/>
-    <w:bookmarkStart w:id="158" w:name="ref-goodrich2013b"/>
+    <w:bookmarkEnd w:id="159"/>
+    <w:bookmarkStart w:id="160" w:name="ref-goodrich2013b"/>
     <w:p>
       <w:pPr>
         <w:pStyle w:val="Bibliography"/>
@@ -17272,8 +18259,8 @@
         <w:t xml:space="preserve">. Cambridge: Cambridge University Press, 2013b.</w:t>
       </w:r>
     </w:p>
-    <w:bookmarkEnd w:id="158"/>
-    <w:bookmarkStart w:id="160" w:name="ref-goodrich2017"/>
+    <w:bookmarkEnd w:id="160"/>
+    <w:bookmarkStart w:id="162" w:name="ref-goodrich2017"/>
     <w:p>
       <w:pPr>
         <w:pStyle w:val="Bibliography"/>
@@ -17284,7 +18271,7 @@
       <w:r>
         <w:t xml:space="preserve"> </w:t>
       </w:r>
-      <w:hyperlink r:id="rId159">
+      <w:hyperlink r:id="rId161">
         <w:r>
           <w:rPr>
             <w:rStyle w:val="Hyperlink"/>
@@ -17309,8 +18296,8 @@
         <w:t xml:space="preserve">, v. 1, n. 1, p. 1–57, 2017.</w:t>
       </w:r>
     </w:p>
-    <w:bookmarkEnd w:id="160"/>
-    <w:bookmarkStart w:id="161" w:name="ref-grossi2007"/>
+    <w:bookmarkEnd w:id="162"/>
+    <w:bookmarkStart w:id="163" w:name="ref-grossi2007"/>
     <w:p>
       <w:pPr>
         <w:pStyle w:val="Bibliography"/>
@@ -17332,8 +18319,8 @@
         <w:t xml:space="preserve">. Tradução: Arno Dal Ri Júnior. Florianópolis: Fundação Boiteux, 2007.</w:t>
       </w:r>
     </w:p>
-    <w:bookmarkEnd w:id="161"/>
-    <w:bookmarkStart w:id="162" w:name="ref-haraway1985"/>
+    <w:bookmarkEnd w:id="163"/>
+    <w:bookmarkStart w:id="164" w:name="ref-haraway1985"/>
     <w:p>
       <w:pPr>
         <w:pStyle w:val="Bibliography"/>
@@ -17355,8 +18342,8 @@
         <w:t xml:space="preserve">, n. 80, p. 65–108, 1985.</w:t>
       </w:r>
     </w:p>
-    <w:bookmarkEnd w:id="162"/>
-    <w:bookmarkStart w:id="163" w:name="ref-haraway2009"/>
+    <w:bookmarkEnd w:id="164"/>
+    <w:bookmarkStart w:id="165" w:name="ref-haraway2009"/>
     <w:p>
       <w:pPr>
         <w:pStyle w:val="Bibliography"/>
@@ -17391,8 +18378,8 @@
         <w:t xml:space="preserve">. Tradução: Tomaz Tadeu. 2. ed. Belo Horizonte: Autêntica, 2009. p. 33–118.</w:t>
       </w:r>
     </w:p>
-    <w:bookmarkEnd w:id="163"/>
-    <w:bookmarkStart w:id="164" w:name="ref-hespanha2005"/>
+    <w:bookmarkEnd w:id="165"/>
+    <w:bookmarkStart w:id="166" w:name="ref-hespanha2005"/>
     <w:p>
       <w:pPr>
         <w:pStyle w:val="Bibliography"/>
@@ -17414,8 +18401,8 @@
         <w:t xml:space="preserve">. Coimbra: Almedina, 2005.</w:t>
       </w:r>
     </w:p>
-    <w:bookmarkEnd w:id="164"/>
-    <w:bookmarkStart w:id="165" w:name="ref-hilden1993"/>
+    <w:bookmarkEnd w:id="166"/>
+    <w:bookmarkStart w:id="167" w:name="ref-hilden1993"/>
     <w:p>
       <w:pPr>
         <w:pStyle w:val="Bibliography"/>
@@ -17450,8 +18437,8 @@
         <w:t xml:space="preserve">. Oxford: Oxford University Press, 1993.</w:t>
       </w:r>
     </w:p>
-    <w:bookmarkEnd w:id="165"/>
-    <w:bookmarkStart w:id="166" w:name="ref-hunt1984"/>
+    <w:bookmarkEnd w:id="167"/>
+    <w:bookmarkStart w:id="168" w:name="ref-hunt1984"/>
     <w:p>
       <w:pPr>
         <w:pStyle w:val="Bibliography"/>
@@ -17473,8 +18460,8 @@
         <w:t xml:space="preserve">. Berkeley: University of California Press, 1984.</w:t>
       </w:r>
     </w:p>
-    <w:bookmarkEnd w:id="166"/>
-    <w:bookmarkStart w:id="167" w:name="ref-huygebaert2015"/>
+    <w:bookmarkEnd w:id="168"/>
+    <w:bookmarkStart w:id="169" w:name="ref-huygebaert2015"/>
     <w:p>
       <w:pPr>
         <w:pStyle w:val="Bibliography"/>
@@ -17522,13 +18509,36 @@
         <w:t xml:space="preserve">: s.n., 2015.</w:t>
       </w:r>
     </w:p>
-    <w:bookmarkEnd w:id="167"/>
-    <w:bookmarkStart w:id="168" w:name="ref-kantorowicz1957"/>
+    <w:bookmarkEnd w:id="169"/>
+    <w:bookmarkStart w:id="170" w:name="ref-jones2023"/>
     <w:p>
       <w:pPr>
         <w:pStyle w:val="Bibliography"/>
       </w:pPr>
       <w:r>
+        <w:t xml:space="preserve">JONES, Emily.</w:t>
+      </w:r>
+      <w:r>
+        <w:t xml:space="preserve"> </w:t>
+      </w:r>
+      <w:r>
+        <w:rPr>
+          <w:b/>
+          <w:bCs/>
+        </w:rPr>
+        <w:t xml:space="preserve">Feminist Theory and International Law: Posthuman Perspectives</w:t>
+      </w:r>
+      <w:r>
+        <w:t xml:space="preserve">. London: Routledge, 2023.</w:t>
+      </w:r>
+    </w:p>
+    <w:bookmarkEnd w:id="170"/>
+    <w:bookmarkStart w:id="171" w:name="ref-kantorowicz1957"/>
+    <w:p>
+      <w:pPr>
+        <w:pStyle w:val="Bibliography"/>
+      </w:pPr>
+      <w:r>
         <w:t xml:space="preserve">KANTOROWICZ, Ernst H.</w:t>
       </w:r>
       <w:r>
@@ -17545,8 +18555,8 @@
         <w:t xml:space="preserve">. Princeton: Princeton University Press, 1957.</w:t>
       </w:r>
     </w:p>
-    <w:bookmarkEnd w:id="168"/>
-    <w:bookmarkStart w:id="169" w:name="ref-kantorowicz1998"/>
+    <w:bookmarkEnd w:id="171"/>
+    <w:bookmarkStart w:id="172" w:name="ref-kantorowicz1998"/>
     <w:p>
       <w:pPr>
         <w:pStyle w:val="Bibliography"/>
@@ -17568,13 +18578,36 @@
         <w:t xml:space="preserve">. Tradução: Cid Knipel Moreira. São Paulo: Companhia das Letras, 1998.</w:t>
       </w:r>
     </w:p>
-    <w:bookmarkEnd w:id="169"/>
-    <w:bookmarkStart w:id="170" w:name="ref-landes2001"/>
+    <w:bookmarkEnd w:id="172"/>
+    <w:bookmarkStart w:id="173" w:name="ref-laboriacuboniks2018"/>
     <w:p>
       <w:pPr>
         <w:pStyle w:val="Bibliography"/>
       </w:pPr>
       <w:r>
+        <w:t xml:space="preserve">LABORIA CUBONIKS.</w:t>
+      </w:r>
+      <w:r>
+        <w:t xml:space="preserve"> </w:t>
+      </w:r>
+      <w:r>
+        <w:rPr>
+          <w:b/>
+          <w:bCs/>
+        </w:rPr>
+        <w:t xml:space="preserve">The Xenofeminist Manifesto: A Politics for Alienation</w:t>
+      </w:r>
+      <w:r>
+        <w:t xml:space="preserve">. London: Verso, 2018.</w:t>
+      </w:r>
+    </w:p>
+    <w:bookmarkEnd w:id="173"/>
+    <w:bookmarkStart w:id="174" w:name="ref-landes2001"/>
+    <w:p>
+      <w:pPr>
+        <w:pStyle w:val="Bibliography"/>
+      </w:pPr>
+      <w:r>
         <w:t xml:space="preserve">LANDES, Joan B.</w:t>
       </w:r>
       <w:r>
@@ -17591,8 +18624,8 @@
         <w:t xml:space="preserve">. Ithaca: Cornell University Press, 2001.</w:t>
       </w:r>
     </w:p>
-    <w:bookmarkEnd w:id="170"/>
-    <w:bookmarkStart w:id="171" w:name="ref-latour1991"/>
+    <w:bookmarkEnd w:id="174"/>
+    <w:bookmarkStart w:id="175" w:name="ref-latour1991"/>
     <w:p>
       <w:pPr>
         <w:pStyle w:val="Bibliography"/>
@@ -17614,8 +18647,8 @@
         <w:t xml:space="preserve">. Paris: La Découverte, 1991.</w:t>
       </w:r>
     </w:p>
-    <w:bookmarkEnd w:id="171"/>
-    <w:bookmarkStart w:id="172" w:name="ref-latour1994"/>
+    <w:bookmarkEnd w:id="175"/>
+    <w:bookmarkStart w:id="176" w:name="ref-latour1994"/>
     <w:p>
       <w:pPr>
         <w:pStyle w:val="Bibliography"/>
@@ -17637,8 +18670,8 @@
         <w:t xml:space="preserve">. Tradução: Carlos Irineu da Costa. Rio de Janeiro: Editora 34, 1994.</w:t>
       </w:r>
     </w:p>
-    <w:bookmarkEnd w:id="172"/>
-    <w:bookmarkStart w:id="173" w:name="ref-legendre1974"/>
+    <w:bookmarkEnd w:id="176"/>
+    <w:bookmarkStart w:id="177" w:name="ref-legendre1974"/>
     <w:p>
       <w:pPr>
         <w:pStyle w:val="Bibliography"/>
@@ -17660,8 +18693,8 @@
         <w:t xml:space="preserve">. Paris: Seuil, 1974.</w:t>
       </w:r>
     </w:p>
-    <w:bookmarkEnd w:id="173"/>
-    <w:bookmarkStart w:id="174" w:name="ref-legendre1994"/>
+    <w:bookmarkEnd w:id="177"/>
+    <w:bookmarkStart w:id="178" w:name="ref-legendre1994"/>
     <w:p>
       <w:pPr>
         <w:pStyle w:val="Bibliography"/>
@@ -17683,8 +18716,8 @@
         <w:t xml:space="preserve">. Paris: Fayard, 1994.</w:t>
       </w:r>
     </w:p>
-    <w:bookmarkEnd w:id="174"/>
-    <w:bookmarkStart w:id="175" w:name="ref-limajunior2020"/>
+    <w:bookmarkEnd w:id="178"/>
+    <w:bookmarkStart w:id="179" w:name="ref-limajunior2020"/>
     <w:p>
       <w:pPr>
         <w:pStyle w:val="Bibliography"/>
@@ -17706,8 +18739,8 @@
         <w:t xml:space="preserve">. tese de doutorado—São Paulo: Universidade de São Paulo, 2020.</w:t>
       </w:r>
     </w:p>
-    <w:bookmarkEnd w:id="175"/>
-    <w:bookmarkStart w:id="176" w:name="ref-manderson2018"/>
+    <w:bookmarkEnd w:id="179"/>
+    <w:bookmarkStart w:id="180" w:name="ref-manderson2018"/>
     <w:p>
       <w:pPr>
         <w:pStyle w:val="Bibliography"/>
@@ -17729,8 +18762,8 @@
         <w:t xml:space="preserve">. Toronto: University of Toronto Press, 2018.</w:t>
       </w:r>
     </w:p>
-    <w:bookmarkEnd w:id="176"/>
-    <w:bookmarkStart w:id="177" w:name="ref-mazon2000"/>
+    <w:bookmarkEnd w:id="180"/>
+    <w:bookmarkStart w:id="181" w:name="ref-mazon2000"/>
     <w:p>
       <w:pPr>
         <w:pStyle w:val="Bibliography"/>
@@ -17752,8 +18785,8 @@
         <w:t xml:space="preserve">, v. 18, n. 2, p. 162–192, 2000.</w:t>
       </w:r>
     </w:p>
-    <w:bookmarkEnd w:id="177"/>
-    <w:bookmarkStart w:id="179" w:name="ref-millat2003"/>
+    <w:bookmarkEnd w:id="181"/>
+    <w:bookmarkStart w:id="183" w:name="ref-millat2003"/>
     <w:p>
       <w:pPr>
         <w:pStyle w:val="Bibliography"/>
@@ -17764,7 +18797,7 @@
       <w:r>
         <w:t xml:space="preserve"> </w:t>
       </w:r>
-      <w:hyperlink r:id="rId178">
+      <w:hyperlink r:id="rId182">
         <w:r>
           <w:rPr>
             <w:rStyle w:val="Hyperlink"/>
@@ -17789,8 +18822,8 @@
         <w:t xml:space="preserve">, 2003.</w:t>
       </w:r>
     </w:p>
-    <w:bookmarkEnd w:id="179"/>
-    <w:bookmarkStart w:id="180" w:name="ref-mirzoeff1999"/>
+    <w:bookmarkEnd w:id="183"/>
+    <w:bookmarkStart w:id="184" w:name="ref-mirzoeff1999"/>
     <w:p>
       <w:pPr>
         <w:pStyle w:val="Bibliography"/>
@@ -17812,8 +18845,8 @@
         <w:t xml:space="preserve">. London: Routledge, 1999.</w:t>
       </w:r>
     </w:p>
-    <w:bookmarkEnd w:id="180"/>
-    <w:bookmarkStart w:id="181" w:name="ref-mitchell1994"/>
+    <w:bookmarkEnd w:id="184"/>
+    <w:bookmarkStart w:id="185" w:name="ref-mitchell1994"/>
     <w:p>
       <w:pPr>
         <w:pStyle w:val="Bibliography"/>
@@ -17835,8 +18868,8 @@
         <w:t xml:space="preserve">. Chicago: University of Chicago Press, 1994.</w:t>
       </w:r>
     </w:p>
-    <w:bookmarkEnd w:id="181"/>
-    <w:bookmarkStart w:id="182" w:name="ref-mondzain2002"/>
+    <w:bookmarkEnd w:id="185"/>
+    <w:bookmarkStart w:id="186" w:name="ref-mondzain2002"/>
     <w:p>
       <w:pPr>
         <w:pStyle w:val="Bibliography"/>
@@ -17858,8 +18891,8 @@
         <w:t xml:space="preserve">. Paris: Seuil, 2002.</w:t>
       </w:r>
     </w:p>
-    <w:bookmarkEnd w:id="182"/>
-    <w:bookmarkStart w:id="183" w:name="ref-mondzain2017"/>
+    <w:bookmarkEnd w:id="186"/>
+    <w:bookmarkStart w:id="187" w:name="ref-mondzain2017"/>
     <w:p>
       <w:pPr>
         <w:pStyle w:val="Bibliography"/>
@@ -17881,8 +18914,8 @@
         <w:t xml:space="preserve">. Paris: Les liens qui libèrent, 2017.</w:t>
       </w:r>
     </w:p>
-    <w:bookmarkEnd w:id="183"/>
-    <w:bookmarkStart w:id="184" w:name="ref-nussbaum1995"/>
+    <w:bookmarkEnd w:id="187"/>
+    <w:bookmarkStart w:id="188" w:name="ref-nussbaum1995"/>
     <w:p>
       <w:pPr>
         <w:pStyle w:val="Bibliography"/>
@@ -17904,13 +18937,50 @@
         <w:t xml:space="preserve">. Boston: Beacon Press, 1995.</w:t>
       </w:r>
     </w:p>
-    <w:bookmarkEnd w:id="184"/>
-    <w:bookmarkStart w:id="185" w:name="ref-panofsky1939"/>
+    <w:bookmarkEnd w:id="188"/>
+    <w:bookmarkStart w:id="190" w:name="ref-oliveira2020"/>
     <w:p>
       <w:pPr>
         <w:pStyle w:val="Bibliography"/>
       </w:pPr>
       <w:r>
+        <w:t xml:space="preserve">OLIVEIRA, Ana.</w:t>
+      </w:r>
+      <w:r>
+        <w:t xml:space="preserve"> </w:t>
+      </w:r>
+      <w:hyperlink r:id="rId189">
+        <w:r>
+          <w:rPr>
+            <w:rStyle w:val="Hyperlink"/>
+          </w:rPr>
+          <w:t xml:space="preserve">Subject (in) Trouble: Humans, Robots, and Legal Imagination</w:t>
+        </w:r>
+      </w:hyperlink>
+      <w:r>
+        <w:t xml:space="preserve">.</w:t>
+      </w:r>
+      <w:r>
+        <w:t xml:space="preserve"> </w:t>
+      </w:r>
+      <w:r>
+        <w:rPr>
+          <w:b/>
+          <w:bCs/>
+        </w:rPr>
+        <w:t xml:space="preserve">Laws</w:t>
+      </w:r>
+      <w:r>
+        <w:t xml:space="preserve">, v. 9, n. 2, p. 10, 2020.</w:t>
+      </w:r>
+    </w:p>
+    <w:bookmarkEnd w:id="190"/>
+    <w:bookmarkStart w:id="191" w:name="ref-panofsky1939"/>
+    <w:p>
+      <w:pPr>
+        <w:pStyle w:val="Bibliography"/>
+      </w:pPr>
+      <w:r>
         <w:t xml:space="preserve">PANOFSKY, Erwin.</w:t>
       </w:r>
       <w:r>
@@ -17927,8 +18997,8 @@
         <w:t xml:space="preserve">. New York: Oxford University Press, 1939.</w:t>
       </w:r>
     </w:p>
-    <w:bookmarkEnd w:id="185"/>
-    <w:bookmarkStart w:id="186" w:name="ref-panofsky1955"/>
+    <w:bookmarkEnd w:id="191"/>
+    <w:bookmarkStart w:id="192" w:name="ref-panofsky1955"/>
     <w:p>
       <w:pPr>
         <w:pStyle w:val="Bibliography"/>
@@ -17950,8 +19020,8 @@
         <w:t xml:space="preserve">. Garden City, NY: Doubleday Anchor, 1955.</w:t>
       </w:r>
     </w:p>
-    <w:bookmarkEnd w:id="186"/>
-    <w:bookmarkStart w:id="187" w:name="ref-pateman1988"/>
+    <w:bookmarkEnd w:id="192"/>
+    <w:bookmarkStart w:id="193" w:name="ref-pateman1988"/>
     <w:p>
       <w:pPr>
         <w:pStyle w:val="Bibliography"/>
@@ -17973,8 +19043,8 @@
         <w:t xml:space="preserve">. Stanford: Stanford University Press, 1988.</w:t>
       </w:r>
     </w:p>
-    <w:bookmarkEnd w:id="187"/>
-    <w:bookmarkStart w:id="188" w:name="ref-pateman1993"/>
+    <w:bookmarkEnd w:id="193"/>
+    <w:bookmarkStart w:id="194" w:name="ref-pateman1993"/>
     <w:p>
       <w:pPr>
         <w:pStyle w:val="Bibliography"/>
@@ -17996,8 +19066,8 @@
         <w:t xml:space="preserve">. Tradução: Marta Avancini. Rio de Janeiro: Paz e Terra, 1993.</w:t>
       </w:r>
     </w:p>
-    <w:bookmarkEnd w:id="188"/>
-    <w:bookmarkStart w:id="189" w:name="ref-patemanmills2007"/>
+    <w:bookmarkEnd w:id="194"/>
+    <w:bookmarkStart w:id="195" w:name="ref-patemanmills2007"/>
     <w:p>
       <w:pPr>
         <w:pStyle w:val="Bibliography"/>
@@ -18019,13 +19089,50 @@
         <w:t xml:space="preserve">. Cambridge: Polity Press, 2007.</w:t>
       </w:r>
     </w:p>
-    <w:bookmarkEnd w:id="189"/>
-    <w:bookmarkStart w:id="190" w:name="ref-resnikcurtis2011"/>
+    <w:bookmarkEnd w:id="195"/>
+    <w:bookmarkStart w:id="197" w:name="ref-renz2023"/>
     <w:p>
       <w:pPr>
         <w:pStyle w:val="Bibliography"/>
       </w:pPr>
       <w:r>
+        <w:t xml:space="preserve">RENZ, Flora.</w:t>
+      </w:r>
+      <w:r>
+        <w:t xml:space="preserve"> </w:t>
+      </w:r>
+      <w:hyperlink r:id="rId196">
+        <w:r>
+          <w:rPr>
+            <w:rStyle w:val="Hyperlink"/>
+          </w:rPr>
+          <w:t xml:space="preserve">The Boundaries of Legal Personhood: Disability, Gender and the Cyborg</w:t>
+        </w:r>
+      </w:hyperlink>
+      <w:r>
+        <w:t xml:space="preserve">.</w:t>
+      </w:r>
+      <w:r>
+        <w:t xml:space="preserve"> </w:t>
+      </w:r>
+      <w:r>
+        <w:rPr>
+          <w:b/>
+          <w:bCs/>
+        </w:rPr>
+        <w:t xml:space="preserve">Law and Critique</w:t>
+      </w:r>
+      <w:r>
+        <w:t xml:space="preserve">, 2023.</w:t>
+      </w:r>
+    </w:p>
+    <w:bookmarkEnd w:id="197"/>
+    <w:bookmarkStart w:id="198" w:name="ref-resnikcurtis2011"/>
+    <w:p>
+      <w:pPr>
+        <w:pStyle w:val="Bibliography"/>
+      </w:pPr>
+      <w:r>
         <w:t xml:space="preserve">RESNIK, Judith; CURTIS, Dennis E.</w:t>
       </w:r>
       <w:r>
@@ -18042,8 +19149,8 @@
         <w:t xml:space="preserve">. New Haven: Yale University Press, 2011.</w:t>
       </w:r>
     </w:p>
-    <w:bookmarkEnd w:id="190"/>
-    <w:bookmarkStart w:id="191" w:name="ref-rich1980"/>
+    <w:bookmarkEnd w:id="198"/>
+    <w:bookmarkStart w:id="199" w:name="ref-rich1980"/>
     <w:p>
       <w:pPr>
         <w:pStyle w:val="Bibliography"/>
@@ -18065,8 +19172,8 @@
         <w:t xml:space="preserve">, v. 5, n. 4, p. 631–660, 1980.</w:t>
       </w:r>
     </w:p>
-    <w:bookmarkEnd w:id="191"/>
-    <w:bookmarkStart w:id="192" w:name="ref-richardson2007"/>
+    <w:bookmarkEnd w:id="199"/>
+    <w:bookmarkStart w:id="200" w:name="ref-richardson2007"/>
     <w:p>
       <w:pPr>
         <w:pStyle w:val="Bibliography"/>
@@ -18088,8 +19195,8 @@
         <w:t xml:space="preserve">. Aldershot: Ashgate, 2007.</w:t>
       </w:r>
     </w:p>
-    <w:bookmarkEnd w:id="192"/>
-    <w:bookmarkStart w:id="193" w:name="ref-richardson2009"/>
+    <w:bookmarkEnd w:id="200"/>
+    <w:bookmarkStart w:id="201" w:name="ref-richardson2009"/>
     <w:p>
       <w:pPr>
         <w:pStyle w:val="Bibliography"/>
@@ -18111,13 +19218,36 @@
         <w:t xml:space="preserve">. Farnham: Ashgate, 2009.</w:t>
       </w:r>
     </w:p>
-    <w:bookmarkEnd w:id="193"/>
-    <w:bookmarkStart w:id="194" w:name="ref-scott1988"/>
+    <w:bookmarkEnd w:id="201"/>
+    <w:bookmarkStart w:id="202" w:name="ref-russell2020"/>
     <w:p>
       <w:pPr>
         <w:pStyle w:val="Bibliography"/>
       </w:pPr>
       <w:r>
+        <w:t xml:space="preserve">RUSSELL, Legacy.</w:t>
+      </w:r>
+      <w:r>
+        <w:t xml:space="preserve"> </w:t>
+      </w:r>
+      <w:r>
+        <w:rPr>
+          <w:b/>
+          <w:bCs/>
+        </w:rPr>
+        <w:t xml:space="preserve">Glitch Feminism: A Manifesto</w:t>
+      </w:r>
+      <w:r>
+        <w:t xml:space="preserve">. Brooklyn: Verso, 2020.</w:t>
+      </w:r>
+    </w:p>
+    <w:bookmarkEnd w:id="202"/>
+    <w:bookmarkStart w:id="203" w:name="ref-scott1988"/>
+    <w:p>
+      <w:pPr>
+        <w:pStyle w:val="Bibliography"/>
+      </w:pPr>
+      <w:r>
         <w:t xml:space="preserve">SCOTT, Joan Wallach.</w:t>
       </w:r>
       <w:r>
@@ -18134,8 +19264,8 @@
         <w:t xml:space="preserve">. New York: Columbia University Press, 1988.</w:t>
       </w:r>
     </w:p>
-    <w:bookmarkEnd w:id="194"/>
-    <w:bookmarkStart w:id="195" w:name="ref-scott1996"/>
+    <w:bookmarkEnd w:id="203"/>
+    <w:bookmarkStart w:id="204" w:name="ref-scott1996"/>
     <w:p>
       <w:pPr>
         <w:pStyle w:val="Bibliography"/>
@@ -18157,13 +19287,36 @@
         <w:t xml:space="preserve">. Cambridge, MA: Harvard University Press, 1996.</w:t>
       </w:r>
     </w:p>
-    <w:bookmarkEnd w:id="195"/>
-    <w:bookmarkStart w:id="196" w:name="ref-thompson2018"/>
+    <w:bookmarkEnd w:id="204"/>
+    <w:bookmarkStart w:id="205" w:name="ref-smith2009"/>
     <w:p>
       <w:pPr>
         <w:pStyle w:val="Bibliography"/>
       </w:pPr>
       <w:r>
+        <w:t xml:space="preserve">SMITH, Nicole R.</w:t>
+      </w:r>
+      <w:r>
+        <w:t xml:space="preserve"> </w:t>
+      </w:r>
+      <w:r>
+        <w:rPr>
+          <w:b/>
+          <w:bCs/>
+        </w:rPr>
+        <w:t xml:space="preserve">Wangechi Mutu: Feminist Collage and the Cyborg</w:t>
+      </w:r>
+      <w:r>
+        <w:t xml:space="preserve">. mathesis—Atlanta: Georgia State University, 2009.</w:t>
+      </w:r>
+    </w:p>
+    <w:bookmarkEnd w:id="205"/>
+    <w:bookmarkStart w:id="206" w:name="ref-thompson2018"/>
+    <w:p>
+      <w:pPr>
+        <w:pStyle w:val="Bibliography"/>
+      </w:pPr>
+      <w:r>
         <w:t xml:space="preserve">THOMPSON, Debra; HAYES, Matthew; NEWMAN, Emily. Intersectional Contract Theory.</w:t>
       </w:r>
       <w:r>
@@ -18180,13 +19333,47 @@
         <w:t xml:space="preserve">, 2018.</w:t>
       </w:r>
     </w:p>
-    <w:bookmarkEnd w:id="196"/>
-    <w:bookmarkStart w:id="197" w:name="ref-vandewaal1973"/>
+    <w:bookmarkEnd w:id="206"/>
+    <w:bookmarkStart w:id="208" w:name="ref-viljanen2017"/>
     <w:p>
       <w:pPr>
         <w:pStyle w:val="Bibliography"/>
       </w:pPr>
       <w:r>
+        <w:t xml:space="preserve">VILJANEN, Mika.</w:t>
+      </w:r>
+      <w:r>
+        <w:t xml:space="preserve"> </w:t>
+      </w:r>
+      <w:hyperlink r:id="rId207">
+        <w:r>
+          <w:rPr>
+            <w:rStyle w:val="Hyperlink"/>
+          </w:rPr>
+          <w:t xml:space="preserve">A Cyborg Turn in Law?</w:t>
+        </w:r>
+      </w:hyperlink>
+      <w:r>
+        <w:t xml:space="preserve"> </w:t>
+      </w:r>
+      <w:r>
+        <w:rPr>
+          <w:b/>
+          <w:bCs/>
+        </w:rPr>
+        <w:t xml:space="preserve">German Law Journal</w:t>
+      </w:r>
+      <w:r>
+        <w:t xml:space="preserve">, v. 18, n. 5, 2017.</w:t>
+      </w:r>
+    </w:p>
+    <w:bookmarkEnd w:id="208"/>
+    <w:bookmarkStart w:id="209" w:name="ref-vandewaal1973"/>
+    <w:p>
+      <w:pPr>
+        <w:pStyle w:val="Bibliography"/>
+      </w:pPr>
+      <w:r>
         <w:t xml:space="preserve">WAAL, Henri van de.</w:t>
       </w:r>
       <w:r>
@@ -18203,8 +19390,8 @@
         <w:t xml:space="preserve">. Amsterdam: North-Holland, 1973.</w:t>
       </w:r>
     </w:p>
-    <w:bookmarkEnd w:id="197"/>
-    <w:bookmarkStart w:id="198" w:name="ref-vandewaal1985"/>
+    <w:bookmarkEnd w:id="209"/>
+    <w:bookmarkStart w:id="210" w:name="ref-vandewaal1985"/>
     <w:p>
       <w:pPr>
         <w:pStyle w:val="Bibliography"/>
@@ -18226,8 +19413,8 @@
         <w:t xml:space="preserve">. Amsterdam: North-Holland, 1985.</w:t>
       </w:r>
     </w:p>
-    <w:bookmarkEnd w:id="198"/>
-    <w:bookmarkStart w:id="199" w:name="ref-warburg2000"/>
+    <w:bookmarkEnd w:id="210"/>
+    <w:bookmarkStart w:id="211" w:name="ref-warburg2000"/>
     <w:p>
       <w:pPr>
         <w:pStyle w:val="Bibliography"/>
@@ -18249,8 +19436,8 @@
         <w:t xml:space="preserve">. Berlin: Akademie Verlag, 2000.</w:t>
       </w:r>
     </w:p>
-    <w:bookmarkEnd w:id="199"/>
-    <w:bookmarkStart w:id="200" w:name="ref-warner1985"/>
+    <w:bookmarkEnd w:id="211"/>
+    <w:bookmarkStart w:id="212" w:name="ref-warner1985"/>
     <w:p>
       <w:pPr>
         <w:pStyle w:val="Bibliography"/>
@@ -18272,10 +19459,10 @@
         <w:t xml:space="preserve">. London: Weidenfeld &amp; Nicolson, 1985.</w:t>
       </w:r>
     </w:p>
-    <w:bookmarkEnd w:id="200"/>
-    <w:bookmarkEnd w:id="201"/>
-    <w:bookmarkEnd w:id="202"/>
-    <w:bookmarkEnd w:id="203"/>
+    <w:bookmarkEnd w:id="212"/>
+    <w:bookmarkEnd w:id="213"/>
+    <w:bookmarkEnd w:id="214"/>
+    <w:bookmarkEnd w:id="215"/>
     <w:sectPr>
       <w:footnotePr>
         <w:numRestart w:val="eachSect"/>

</xml_diff>

<commit_message>
chore: Reconcile duplicate allegories (FR-024/US-016) in records, purification and id-mapping
</commit_message>
<xml_diff>
--- a/tese/tese_completa.docx
+++ b/tese/tese_completa.docx
@@ -10156,7 +10156,24 @@
         <w:pStyle w:val="BodyText"/>
       </w:pPr>
       <w:r>
-        <w:t xml:space="preserve">O delta médio absoluto foi de 0,18 ponto (escala 0–3), sem viés sistemático (média algébrica ≈ –0,04).</w:t>
+        <w:t xml:space="preserve">O delta médio absoluto foi de 0,18 ponto (escala 0–3), sem viés sistemático (média algébrica</w:t>
+      </w:r>
+      <w:r>
+        <w:t xml:space="preserve"> </w:t>
+      </w:r>
+      <m:oMath>
+        <m:r>
+          <m:rPr>
+            <m:sty m:val="p"/>
+          </m:rPr>
+          <m:t>≈</m:t>
+        </m:r>
+      </m:oMath>
+      <w:r>
+        <w:t xml:space="preserve"> </w:t>
+      </w:r>
+      <w:r>
+        <w:t xml:space="preserve">–0,04).</w:t>
       </w:r>
     </w:p>
     <w:bookmarkEnd w:id="77"/>

</xml_diff>